<commit_message>
Housekeeping: npm audit fix, spec doc route table matches implementation (P3-9)
npm audit fix applied -- 3 high CVEs (sharp via miniflare via wrangler,
dev-only) resolved, npm audit now reports 0 vulnerabilities. tsc --noEmit
re-verified clean afterward.

The_Arena_Specification.docx section 10's route table listed
/admin/models, /admin/trigger-build, /admin/metrics -- never built. Replaced
with the 4 routes actually implemented (/admin/events,
/admin/events/{id}/tick, /admin/events/{id}/build-status,
/admin/events/{id}/start-date), per the backlog's call that the
implementation is the better design. Verified with a schema validator
against the original (paragraph count delta matches exactly: 3 old rows
minus 4 new rows at 4 cells each).

package.json's stale version field intentionally left untouched per explicit
user instruction.

Co-Authored-By: Claude Sonnet 5 <noreply@anthropic.com>
</commit_message>
<xml_diff>
--- a/The_Arena_Specification.docx
+++ b/The_Arena_Specification.docx
@@ -4758,7 +4758,7 @@
                 <w:sz w:val="19"/>
                 <w:szCs w:val="19"/>
               </w:rPr>
-              <w:t xml:space="preserve">/admin/models</w:t>
+              <w:t xml:space="preserve">/admin/events</w:t>
             </w:r>
           </w:p>
         </w:tc>
@@ -4778,7 +4778,7 @@
                 <w:sz w:val="19"/>
                 <w:szCs w:val="19"/>
               </w:rPr>
-              <w:t xml:space="preserve">Add model to registry</w:t>
+              <w:t xml:space="preserve">Create a new event</w:t>
             </w:r>
           </w:p>
         </w:tc>
@@ -4840,7 +4840,7 @@
                 <w:sz w:val="19"/>
                 <w:szCs w:val="19"/>
               </w:rPr>
-              <w:t xml:space="preserve">/admin/trigger-build</w:t>
+              <w:t xml:space="preserve">/admin/events/{id}/tick</w:t>
             </w:r>
           </w:p>
         </w:tc>
@@ -4860,7 +4860,7 @@
                 <w:sz w:val="19"/>
                 <w:szCs w:val="19"/>
               </w:rPr>
-              <w:t xml:space="preserve">Dispatch a GitHub Actions build turn</w:t>
+              <w:t xml:space="preserve">Manually trigger phase advancement + queue drain for one event</w:t>
             </w:r>
           </w:p>
         </w:tc>
@@ -4922,7 +4922,7 @@
                 <w:sz w:val="19"/>
                 <w:szCs w:val="19"/>
               </w:rPr>
-              <w:t xml:space="preserve">/admin/metrics</w:t>
+              <w:t xml:space="preserve">/admin/events/{id}/build-status</w:t>
             </w:r>
           </w:p>
         </w:tc>
@@ -4942,7 +4942,89 @@
                 <w:sz w:val="19"/>
                 <w:szCs w:val="19"/>
               </w:rPr>
-              <w:t xml:space="preserve">System metrics incl. daily provider usage</w:t>
+              <w:t xml:space="preserve">Poll GitHub Actions build-turn status per hackathon team</w:t>
+            </w:r>
+          </w:p>
+        </w:tc>
+        <w:tc>
+          <w:tcPr>
+            <w:tcW w:type="dxa" w:w="1850"/>
+            <w:tcMar>
+              <w:top w:type="dxa" w:w="70"/>
+              <w:left w:type="dxa" w:w="100"/>
+              <w:bottom w:type="dxa" w:w="70"/>
+              <w:right w:type="dxa" w:w="100"/>
+            </w:tcMar>
+          </w:tcPr>
+          <w:p>
+            <w:r>
+              <w:rPr>
+                <w:sz w:val="19"/>
+                <w:szCs w:val="19"/>
+              </w:rPr>
+              <w:t xml:space="preserve">Admin bearer token</w:t>
+            </w:r>
+          </w:p>
+        </w:tc>
+      </w:tr>
+      <w:tr>
+        <w:tc>
+          <w:tcPr>
+            <w:tcW w:type="dxa" w:w="900"/>
+            <w:tcMar>
+              <w:top w:type="dxa" w:w="70"/>
+              <w:left w:type="dxa" w:w="100"/>
+              <w:bottom w:type="dxa" w:w="70"/>
+              <w:right w:type="dxa" w:w="100"/>
+            </w:tcMar>
+          </w:tcPr>
+          <w:p>
+            <w:r>
+              <w:rPr>
+                <w:sz w:val="19"/>
+                <w:szCs w:val="19"/>
+              </w:rPr>
+              <w:t xml:space="preserve">PATCH</w:t>
+            </w:r>
+          </w:p>
+        </w:tc>
+        <w:tc>
+          <w:tcPr>
+            <w:tcW w:type="dxa" w:w="2700"/>
+            <w:tcMar>
+              <w:top w:type="dxa" w:w="70"/>
+              <w:left w:type="dxa" w:w="100"/>
+              <w:bottom w:type="dxa" w:w="70"/>
+              <w:right w:type="dxa" w:w="100"/>
+            </w:tcMar>
+          </w:tcPr>
+          <w:p>
+            <w:r>
+              <w:rPr>
+                <w:sz w:val="19"/>
+                <w:szCs w:val="19"/>
+              </w:rPr>
+              <w:t xml:space="preserve">/admin/events/{id}/start-date</w:t>
+            </w:r>
+          </w:p>
+        </w:tc>
+        <w:tc>
+          <w:tcPr>
+            <w:tcW w:type="dxa" w:w="3900"/>
+            <w:tcMar>
+              <w:top w:type="dxa" w:w="70"/>
+              <w:left w:type="dxa" w:w="100"/>
+              <w:bottom w:type="dxa" w:w="70"/>
+              <w:right w:type="dxa" w:w="100"/>
+            </w:tcMar>
+          </w:tcPr>
+          <w:p>
+            <w:r>
+              <w:rPr>
+                <w:sz w:val="19"/>
+                <w:szCs w:val="19"/>
+              </w:rPr>
+              <w:t xml:space="preserve">Backdate an event's start_date (compressed-schedule verification tooling)</w:t>
             </w:r>
           </w:p>
         </w:tc>

</xml_diff>